<commit_message>
docs: close out verified AI Owner Assistant milestone
</commit_message>
<xml_diff>
--- a/docs/manual/WineShopPOS_User_Manual.docx
+++ b/docs/manual/WineShopPOS_User_Manual.docx
@@ -2733,6 +2733,182 @@
         <w:t>Multi-branch/offline sync</w:t>
       </w:r>
     </w:p>
+    <w:p>
+      <w:r>
+        <w:br w:type="page"/>
+      </w:r>
+    </w:p>
+    <w:p>
+      <w:pPr>
+        <w:pStyle w:val="Heading1"/>
+      </w:pPr>
+      <w:r>
+        <w:t>Ask WineShopPOS (PRO)</w:t>
+      </w:r>
+    </w:p>
+    <w:p>
+      <w:r>
+        <w:t>Ask WineShopPOS is the Owner Center business copilot for quick questions about your shop.</w:t>
+      </w:r>
+    </w:p>
+    <w:p>
+      <w:pPr>
+        <w:pStyle w:val="Heading2"/>
+      </w:pPr>
+      <w:r>
+        <w:t>Who can use it</w:t>
+      </w:r>
+    </w:p>
+    <w:p>
+      <w:r>
+        <w:t>Ask WineShopPOS is currently available to authorized ADMIN users from Owner Center &gt; Ask WineShopPOS.</w:t>
+      </w:r>
+    </w:p>
+    <w:p>
+      <w:pPr>
+        <w:pStyle w:val="Heading2"/>
+      </w:pPr>
+      <w:r>
+        <w:t>What you can ask</w:t>
+      </w:r>
+    </w:p>
+    <w:p>
+      <w:pPr>
+        <w:pStyle w:val="ListBullet"/>
+      </w:pPr>
+      <w:r>
+        <w:t>How is my shop performing today?</w:t>
+      </w:r>
+    </w:p>
+    <w:p>
+      <w:pPr>
+        <w:pStyle w:val="ListBullet"/>
+      </w:pPr>
+      <w:r>
+        <w:t>What should I reorder?</w:t>
+      </w:r>
+    </w:p>
+    <w:p>
+      <w:pPr>
+        <w:pStyle w:val="ListBullet"/>
+      </w:pPr>
+      <w:r>
+        <w:t>Which products may run out soon?</w:t>
+      </w:r>
+    </w:p>
+    <w:p>
+      <w:pPr>
+        <w:pStyle w:val="ListBullet"/>
+      </w:pPr>
+      <w:r>
+        <w:t>Which products are moving slowly?</w:t>
+      </w:r>
+    </w:p>
+    <w:p>
+      <w:pPr>
+        <w:pStyle w:val="ListBullet"/>
+      </w:pPr>
+      <w:r>
+        <w:t>How is my profit today?</w:t>
+      </w:r>
+    </w:p>
+    <w:p>
+      <w:pPr>
+        <w:pStyle w:val="ListBullet"/>
+      </w:pPr>
+      <w:r>
+        <w:t>Which supplier prices changed?</w:t>
+      </w:r>
+    </w:p>
+    <w:p>
+      <w:pPr>
+        <w:pStyle w:val="ListBullet"/>
+      </w:pPr>
+      <w:r>
+        <w:t>Show me stock movement for a product.</w:t>
+      </w:r>
+    </w:p>
+    <w:p>
+      <w:pPr>
+        <w:pStyle w:val="ListBullet"/>
+      </w:pPr>
+      <w:r>
+        <w:t>Are there shift differences I should review?</w:t>
+      </w:r>
+    </w:p>
+    <w:p>
+      <w:pPr>
+        <w:pStyle w:val="ListBullet"/>
+      </w:pPr>
+      <w:r>
+        <w:t>What expenses affected my business?</w:t>
+      </w:r>
+    </w:p>
+    <w:p>
+      <w:pPr>
+        <w:pStyle w:val="ListBullet"/>
+      </w:pPr>
+      <w:r>
+        <w:t>Is there anything operational that needs my attention?</w:t>
+      </w:r>
+    </w:p>
+    <w:p>
+      <w:pPr>
+        <w:pStyle w:val="Heading2"/>
+      </w:pPr>
+      <w:r>
+        <w:t>Shop selection</w:t>
+      </w:r>
+    </w:p>
+    <w:p>
+      <w:r>
+        <w:t>The shop context comes from your WineShopPOS account. If your account is authorized for more than one shop, use the available shop/scope selector to choose the business context you want to review.</w:t>
+      </w:r>
+    </w:p>
+    <w:p>
+      <w:pPr>
+        <w:pStyle w:val="Heading2"/>
+      </w:pPr>
+      <w:r>
+        <w:t>Using the answer</w:t>
+      </w:r>
+    </w:p>
+    <w:p>
+      <w:r>
+        <w:t>Ask WineShopPOS explains the business information available in the application and can point you to the relevant screen for more detail. AI V1 provides insights and recommendations; final operational actions remain under the user's control in normal WineShopPOS workflows.</w:t>
+      </w:r>
+    </w:p>
+    <w:p>
+      <w:pPr>
+        <w:pStyle w:val="Heading2"/>
+      </w:pPr>
+      <w:r>
+        <w:t>If AI is temporarily unavailable</w:t>
+      </w:r>
+    </w:p>
+    <w:p>
+      <w:r>
+        <w:t>Your normal POS, billing, inventory, purchasing and operational workflows continue to work. Try the AI question again after a short interval.</w:t>
+      </w:r>
+    </w:p>
+    <w:p>
+      <w:pPr>
+        <w:pStyle w:val="Heading2"/>
+      </w:pPr>
+      <w:r>
+        <w:t>Example</w:t>
+      </w:r>
+    </w:p>
+    <w:p>
+      <w:r>
+        <w:t>Question: How is my shop performing today?</w:t>
+      </w:r>
+    </w:p>
+    <w:p>
+      <w:r>
+        <w:t>Ask WineShopPOS can combine current sales, profit, expenses, shift information and operational exceptions into one business summary.</w:t>
+      </w:r>
+    </w:p>
     <w:sectPr>
       <w:headerReference w:type="default" r:id="rId9"/>
       <w:footerReference w:type="default" r:id="rId10"/>

</xml_diff>